<commit_message>
Atualiza manuais e códigos de erro (.rar, PER/DCOMP, NFS-e de isento, .pfx)
- Dicionário §4.4: E210 COLISAO_PERDCOMP, E703 FERRAMENTA_EXTRACAO_AUSENTE,
  E704 ARQUIVO_COMPACTADO_CORROMPIDO.
- Catálogo de Códigos de Erro: acrescenta E209 (faltava), E210, E703, E704.
- Manual de Uso: seção 4 reescrita (fiscal já organizado, exceção NFS-e de
  isento, certificado .pfx, IRPF suspenso) e aviso sobre .zip/.rar.

Co-Authored-By: Claude Sonnet 5 <noreply@anthropic.com>
</commit_message>
<xml_diff>
--- a/MANUAIS/Catalogo de Codigos de Erro - Nilma Contabilidade.docx
+++ b/MANUAIS/Catalogo de Codigos de Erro - Nilma Contabilidade.docx
@@ -1896,6 +1896,186 @@
           </w:p>
         </w:tc>
       </w:tr>
+      <w:tr>
+        <w:tc>
+          <w:tcPr>
+            <w:tcW w:type="dxa" w:w="900"/>
+            <w:tcMar>
+              <w:top w:type="dxa" w:w="70"/>
+              <w:left w:type="dxa" w:w="100"/>
+              <w:bottom w:type="dxa" w:w="70"/>
+              <w:right w:type="dxa" w:w="100"/>
+            </w:tcMar>
+          </w:tcPr>
+          <w:p>
+            <w:r>
+              <w:rPr>
+                <w:b/>
+                <w:bCs/>
+                <w:sz w:val="18"/>
+                <w:szCs w:val="18"/>
+              </w:rPr>
+              <w:t xml:space="preserve">E209</w:t>
+            </w:r>
+          </w:p>
+        </w:tc>
+        <w:tc>
+          <w:tcPr>
+            <w:tcW w:type="dxa" w:w="2600"/>
+            <w:tcMar>
+              <w:top w:type="dxa" w:w="70"/>
+              <w:left w:type="dxa" w:w="100"/>
+              <w:bottom w:type="dxa" w:w="70"/>
+              <w:right w:type="dxa" w:w="100"/>
+            </w:tcMar>
+          </w:tcPr>
+          <w:p>
+            <w:r>
+              <w:rPr>
+                <w:b w:val="false"/>
+                <w:bCs w:val="false"/>
+                <w:sz w:val="18"/>
+                <w:szCs w:val="18"/>
+              </w:rPr>
+              <w:t xml:space="preserve">VINCULO_SOCIO_EMPRESA_INDISPONIVEL</w:t>
+            </w:r>
+          </w:p>
+        </w:tc>
+        <w:tc>
+          <w:tcPr>
+            <w:tcW w:type="dxa" w:w="3400"/>
+            <w:tcMar>
+              <w:top w:type="dxa" w:w="70"/>
+              <w:left w:type="dxa" w:w="100"/>
+              <w:bottom w:type="dxa" w:w="70"/>
+              <w:right w:type="dxa" w:w="100"/>
+            </w:tcMar>
+          </w:tcPr>
+          <w:p>
+            <w:r>
+              <w:rPr>
+                <w:b w:val="false"/>
+                <w:bCs w:val="false"/>
+                <w:sz w:val="18"/>
+                <w:szCs w:val="18"/>
+              </w:rPr>
+              <w:t xml:space="preserve">IRPF do sócio identificado, mas a planilha de cadastro não tem CPF de sócio pra achar a empresa certa</w:t>
+            </w:r>
+          </w:p>
+        </w:tc>
+        <w:tc>
+          <w:tcPr>
+            <w:tcW w:type="dxa" w:w="2600"/>
+            <w:tcMar>
+              <w:top w:type="dxa" w:w="70"/>
+              <w:left w:type="dxa" w:w="100"/>
+              <w:bottom w:type="dxa" w:w="70"/>
+              <w:right w:type="dxa" w:w="100"/>
+            </w:tcMar>
+          </w:tcPr>
+          <w:p>
+            <w:r>
+              <w:rPr>
+                <w:b w:val="false"/>
+                <w:bCs w:val="false"/>
+                <w:sz w:val="18"/>
+                <w:szCs w:val="18"/>
+              </w:rPr>
+              <w:t xml:space="preserve">Cadastrar coluna de CPF dos sócios na planilha — pendência de dado, não de regra</w:t>
+            </w:r>
+          </w:p>
+        </w:tc>
+      </w:tr>
+      <w:tr>
+        <w:tc>
+          <w:tcPr>
+            <w:tcW w:type="dxa" w:w="900"/>
+            <w:tcMar>
+              <w:top w:type="dxa" w:w="70"/>
+              <w:left w:type="dxa" w:w="100"/>
+              <w:bottom w:type="dxa" w:w="70"/>
+              <w:right w:type="dxa" w:w="100"/>
+            </w:tcMar>
+          </w:tcPr>
+          <w:p>
+            <w:r>
+              <w:rPr>
+                <w:b/>
+                <w:bCs/>
+                <w:sz w:val="18"/>
+                <w:szCs w:val="18"/>
+              </w:rPr>
+              <w:t xml:space="preserve">E210</w:t>
+            </w:r>
+          </w:p>
+        </w:tc>
+        <w:tc>
+          <w:tcPr>
+            <w:tcW w:type="dxa" w:w="2600"/>
+            <w:tcMar>
+              <w:top w:type="dxa" w:w="70"/>
+              <w:left w:type="dxa" w:w="100"/>
+              <w:bottom w:type="dxa" w:w="70"/>
+              <w:right w:type="dxa" w:w="100"/>
+            </w:tcMar>
+          </w:tcPr>
+          <w:p>
+            <w:r>
+              <w:rPr>
+                <w:b w:val="false"/>
+                <w:bCs w:val="false"/>
+                <w:sz w:val="18"/>
+                <w:szCs w:val="18"/>
+              </w:rPr>
+              <w:t xml:space="preserve">COLISAO_PERDCOMP</w:t>
+            </w:r>
+          </w:p>
+        </w:tc>
+        <w:tc>
+          <w:tcPr>
+            <w:tcW w:type="dxa" w:w="3400"/>
+            <w:tcMar>
+              <w:top w:type="dxa" w:w="70"/>
+              <w:left w:type="dxa" w:w="100"/>
+              <w:bottom w:type="dxa" w:w="70"/>
+              <w:right w:type="dxa" w:w="100"/>
+            </w:tcMar>
+          </w:tcPr>
+          <w:p>
+            <w:r>
+              <w:rPr>
+                <w:b w:val="false"/>
+                <w:bCs w:val="false"/>
+                <w:sz w:val="18"/>
+                <w:szCs w:val="18"/>
+              </w:rPr>
+              <w:t xml:space="preserve">Dúvida entre Restituição, Reembolso, Ressarcimento e Compensação (PER/DCOMP)</w:t>
+            </w:r>
+          </w:p>
+        </w:tc>
+        <w:tc>
+          <w:tcPr>
+            <w:tcW w:type="dxa" w:w="2600"/>
+            <w:tcMar>
+              <w:top w:type="dxa" w:w="70"/>
+              <w:left w:type="dxa" w:w="100"/>
+              <w:bottom w:type="dxa" w:w="70"/>
+              <w:right w:type="dxa" w:w="100"/>
+            </w:tcMar>
+          </w:tcPr>
+          <w:p>
+            <w:r>
+              <w:rPr>
+                <w:b w:val="false"/>
+                <w:bCs w:val="false"/>
+                <w:sz w:val="18"/>
+                <w:szCs w:val="18"/>
+              </w:rPr>
+              <w:t xml:space="preserve">Revisar manualmente pelo tipo de crédito declarado no documento</w:t>
+            </w:r>
+          </w:p>
+        </w:tc>
+      </w:tr>
     </w:tbl>
     <w:p>
       <w:pPr>
@@ -4909,6 +5089,186 @@
                 <w:szCs w:val="18"/>
               </w:rPr>
               <w:t xml:space="preserve">Revisar manualmente</w:t>
+            </w:r>
+          </w:p>
+        </w:tc>
+      </w:tr>
+      <w:tr>
+        <w:tc>
+          <w:tcPr>
+            <w:tcW w:type="dxa" w:w="900"/>
+            <w:tcMar>
+              <w:top w:type="dxa" w:w="70"/>
+              <w:left w:type="dxa" w:w="100"/>
+              <w:bottom w:type="dxa" w:w="70"/>
+              <w:right w:type="dxa" w:w="100"/>
+            </w:tcMar>
+          </w:tcPr>
+          <w:p>
+            <w:r>
+              <w:rPr>
+                <w:b/>
+                <w:bCs/>
+                <w:sz w:val="18"/>
+                <w:szCs w:val="18"/>
+              </w:rPr>
+              <w:t xml:space="preserve">E703</w:t>
+            </w:r>
+          </w:p>
+        </w:tc>
+        <w:tc>
+          <w:tcPr>
+            <w:tcW w:type="dxa" w:w="2600"/>
+            <w:tcMar>
+              <w:top w:type="dxa" w:w="70"/>
+              <w:left w:type="dxa" w:w="100"/>
+              <w:bottom w:type="dxa" w:w="70"/>
+              <w:right w:type="dxa" w:w="100"/>
+            </w:tcMar>
+          </w:tcPr>
+          <w:p>
+            <w:r>
+              <w:rPr>
+                <w:b w:val="false"/>
+                <w:bCs w:val="false"/>
+                <w:sz w:val="18"/>
+                <w:szCs w:val="18"/>
+              </w:rPr>
+              <w:t xml:space="preserve">FERRAMENTA_EXTRACAO_AUSENTE</w:t>
+            </w:r>
+          </w:p>
+        </w:tc>
+        <w:tc>
+          <w:tcPr>
+            <w:tcW w:type="dxa" w:w="3400"/>
+            <w:tcMar>
+              <w:top w:type="dxa" w:w="70"/>
+              <w:left w:type="dxa" w:w="100"/>
+              <w:bottom w:type="dxa" w:w="70"/>
+              <w:right w:type="dxa" w:w="100"/>
+            </w:tcMar>
+          </w:tcPr>
+          <w:p>
+            <w:r>
+              <w:rPr>
+                <w:b w:val="false"/>
+                <w:bCs w:val="false"/>
+                <w:sz w:val="18"/>
+                <w:szCs w:val="18"/>
+              </w:rPr>
+              <w:t xml:space="preserve">Arquivo .rar encontrado, mas o programa que abre .rar (WinRAR) não está instalado neste computador</w:t>
+            </w:r>
+          </w:p>
+        </w:tc>
+        <w:tc>
+          <w:tcPr>
+            <w:tcW w:type="dxa" w:w="2600"/>
+            <w:tcMar>
+              <w:top w:type="dxa" w:w="70"/>
+              <w:left w:type="dxa" w:w="100"/>
+              <w:bottom w:type="dxa" w:w="70"/>
+              <w:right w:type="dxa" w:w="100"/>
+            </w:tcMar>
+          </w:tcPr>
+          <w:p>
+            <w:r>
+              <w:rPr>
+                <w:b w:val="false"/>
+                <w:bCs w:val="false"/>
+                <w:sz w:val="18"/>
+                <w:szCs w:val="18"/>
+              </w:rPr>
+              <w:t xml:space="preserve">Instalar o WinRAR ou reenviar o conteúdo como .zip; o .rar fica intocado enquanto isso</w:t>
+            </w:r>
+          </w:p>
+        </w:tc>
+      </w:tr>
+      <w:tr>
+        <w:tc>
+          <w:tcPr>
+            <w:tcW w:type="dxa" w:w="900"/>
+            <w:tcMar>
+              <w:top w:type="dxa" w:w="70"/>
+              <w:left w:type="dxa" w:w="100"/>
+              <w:bottom w:type="dxa" w:w="70"/>
+              <w:right w:type="dxa" w:w="100"/>
+            </w:tcMar>
+          </w:tcPr>
+          <w:p>
+            <w:r>
+              <w:rPr>
+                <w:b/>
+                <w:bCs/>
+                <w:sz w:val="18"/>
+                <w:szCs w:val="18"/>
+              </w:rPr>
+              <w:t xml:space="preserve">E704</w:t>
+            </w:r>
+          </w:p>
+        </w:tc>
+        <w:tc>
+          <w:tcPr>
+            <w:tcW w:type="dxa" w:w="2600"/>
+            <w:tcMar>
+              <w:top w:type="dxa" w:w="70"/>
+              <w:left w:type="dxa" w:w="100"/>
+              <w:bottom w:type="dxa" w:w="70"/>
+              <w:right w:type="dxa" w:w="100"/>
+            </w:tcMar>
+          </w:tcPr>
+          <w:p>
+            <w:r>
+              <w:rPr>
+                <w:b w:val="false"/>
+                <w:bCs w:val="false"/>
+                <w:sz w:val="18"/>
+                <w:szCs w:val="18"/>
+              </w:rPr>
+              <w:t xml:space="preserve">ARQUIVO_COMPACTADO_CORROMPIDO</w:t>
+            </w:r>
+          </w:p>
+        </w:tc>
+        <w:tc>
+          <w:tcPr>
+            <w:tcW w:type="dxa" w:w="3400"/>
+            <w:tcMar>
+              <w:top w:type="dxa" w:w="70"/>
+              <w:left w:type="dxa" w:w="100"/>
+              <w:bottom w:type="dxa" w:w="70"/>
+              <w:right w:type="dxa" w:w="100"/>
+            </w:tcMar>
+          </w:tcPr>
+          <w:p>
+            <w:r>
+              <w:rPr>
+                <w:b w:val="false"/>
+                <w:bCs w:val="false"/>
+                <w:sz w:val="18"/>
+                <w:szCs w:val="18"/>
+              </w:rPr>
+              <w:t xml:space="preserve">O .zip/.rar não abriu (corrompido ou protegido por senha)</w:t>
+            </w:r>
+          </w:p>
+        </w:tc>
+        <w:tc>
+          <w:tcPr>
+            <w:tcW w:type="dxa" w:w="2600"/>
+            <w:tcMar>
+              <w:top w:type="dxa" w:w="70"/>
+              <w:left w:type="dxa" w:w="100"/>
+              <w:bottom w:type="dxa" w:w="70"/>
+              <w:right w:type="dxa" w:w="100"/>
+            </w:tcMar>
+          </w:tcPr>
+          <w:p>
+            <w:r>
+              <w:rPr>
+                <w:b w:val="false"/>
+                <w:bCs w:val="false"/>
+                <w:sz w:val="18"/>
+                <w:szCs w:val="18"/>
+              </w:rPr>
+              <w:t xml:space="preserve">Pedir o arquivo de novo ao cliente ou informar a senha; o compactado fica intocado</w:t>
             </w:r>
           </w:p>
         </w:tc>

</xml_diff>